<commit_message>
c'est une deuxieme version
</commit_message>
<xml_diff>
--- a/tuto/tuto-git.docx
+++ b/tuto/tuto-git.docx
@@ -8,6 +8,12 @@
       </w:r>
       <w:r>
         <w:t xml:space="preserve"> c’est un bon moyen pour apprendre pratiquer</w:t>
+      </w:r>
+      <w:r>
+        <w:t>, je vais apporter un premier changement</w:t>
+      </w:r>
+      <w:r>
+        <w:t xml:space="preserve"> et un autre changement.</w:t>
       </w:r>
     </w:p>
     <w:sectPr>

</xml_diff>